<commit_message>
feat(cgad): conjunto de dados anotado com 1200 documentos e telas de anotacao
</commit_message>
<xml_diff>
--- a/scripts/automacao/templates/antecedentes.docx
+++ b/scripts/automacao/templates/antecedentes.docx
@@ -133,7 +133,7 @@
           <w:sz w:val="32"/>
           <w:szCs w:val="32"/>
         </w:rPr>
-        <w:t>DESPACHO</w:t>
+        <w:t>INFORMAÇÃO INSTRUTIVA</w:t>
       </w:r>
     </w:p>
     <w:p>
@@ -282,6 +282,14 @@
         <w:tblInd w:w="-459" w:type="dxa"/>
         <w:tblLayout w:type="fixed"/>
         <w:tblLook w:val="0000"/>
+        <w:tblBorders>
+          <w:top w:val="single" w:sz="4" w:color="2E5B3C"/>
+          <w:bottom w:val="single" w:sz="4" w:color="2E5B3C"/>
+          <w:left w:val="single" w:sz="4" w:color="2E5B3C"/>
+          <w:right w:val="single" w:sz="4" w:color="2E5B3C"/>
+          <w:insideH w:val="single" w:sz="4" w:color="CCCCCC"/>
+          <w:insideV w:val="single" w:sz="4" w:color="CCCCCC"/>
+        </w:tblBorders>
       </w:tblPr>
       <w:tblGrid>
         <w:gridCol w:w="1560"/>
@@ -337,6 +345,7 @@
                 <w:rFonts w:ascii="Times New Roman" w:hAnsi="Times New Roman" w:cs="Times New Roman"/>
                 <w:b/>
                 <w:bCs/>
+                <w:color w:val="2E5B3C"/>
                 <w:sz w:val="22"/>
               </w:rPr>
               <w:t>Condenações de {{</w:t>
@@ -347,6 +356,7 @@
                 <w:rFonts w:ascii="Times New Roman" w:hAnsi="Times New Roman" w:cs="Times New Roman"/>
                 <w:b/>
                 <w:bCs/>
+                <w:color w:val="2E5B3C"/>
                 <w:sz w:val="22"/>
               </w:rPr>
               <w:t>p.nome</w:t>
@@ -357,6 +367,7 @@
                 <w:rFonts w:ascii="Times New Roman" w:hAnsi="Times New Roman" w:cs="Times New Roman"/>
                 <w:b/>
                 <w:bCs/>
+                <w:color w:val="2E5B3C"/>
                 <w:sz w:val="22"/>
               </w:rPr>
               <w:t>}} {%</w:t>
@@ -368,6 +379,7 @@
                 <w:rFonts w:ascii="Times New Roman" w:hAnsi="Times New Roman" w:cs="Times New Roman"/>
                 <w:b/>
                 <w:bCs/>
+                <w:color w:val="2E5B3C"/>
                 <w:sz w:val="22"/>
               </w:rPr>
               <w:t>if</w:t>
@@ -379,6 +391,7 @@
                 <w:rFonts w:ascii="Times New Roman" w:hAnsi="Times New Roman" w:cs="Times New Roman"/>
                 <w:b/>
                 <w:bCs/>
+                <w:color w:val="2E5B3C"/>
                 <w:sz w:val="22"/>
               </w:rPr>
               <w:t xml:space="preserve"> </w:t>
@@ -389,6 +402,7 @@
                 <w:rFonts w:ascii="Times New Roman" w:hAnsi="Times New Roman" w:cs="Times New Roman"/>
                 <w:b/>
                 <w:bCs/>
+                <w:color w:val="2E5B3C"/>
                 <w:sz w:val="22"/>
               </w:rPr>
               <w:t>p.cpf%</w:t>
@@ -399,6 +413,7 @@
                 <w:rFonts w:ascii="Times New Roman" w:hAnsi="Times New Roman" w:cs="Times New Roman"/>
                 <w:b/>
                 <w:bCs/>
+                <w:color w:val="2E5B3C"/>
                 <w:sz w:val="22"/>
               </w:rPr>
               <w:t>}(CPF: {{</w:t>
@@ -409,6 +424,7 @@
                 <w:rFonts w:ascii="Times New Roman" w:hAnsi="Times New Roman" w:cs="Times New Roman"/>
                 <w:b/>
                 <w:bCs/>
+                <w:color w:val="2E5B3C"/>
                 <w:sz w:val="22"/>
               </w:rPr>
               <w:t>p.cpf</w:t>
@@ -419,6 +435,7 @@
                 <w:rFonts w:ascii="Times New Roman" w:hAnsi="Times New Roman" w:cs="Times New Roman"/>
                 <w:b/>
                 <w:bCs/>
+                <w:color w:val="2E5B3C"/>
                 <w:sz w:val="22"/>
               </w:rPr>
               <w:t>}}){%</w:t>
@@ -429,6 +446,7 @@
                 <w:rFonts w:ascii="Times New Roman" w:hAnsi="Times New Roman" w:cs="Times New Roman"/>
                 <w:b/>
                 <w:bCs/>
+                <w:color w:val="2E5B3C"/>
                 <w:sz w:val="22"/>
               </w:rPr>
               <w:t>endif</w:t>
@@ -439,6 +457,7 @@
                 <w:rFonts w:ascii="Times New Roman" w:hAnsi="Times New Roman" w:cs="Times New Roman"/>
                 <w:b/>
                 <w:bCs/>
+                <w:color w:val="2E5B3C"/>
                 <w:sz w:val="22"/>
               </w:rPr>
               <w:t>%} {%</w:t>
@@ -449,6 +468,7 @@
                 <w:rFonts w:ascii="Times New Roman" w:hAnsi="Times New Roman" w:cs="Times New Roman"/>
                 <w:b/>
                 <w:bCs/>
+                <w:color w:val="2E5B3C"/>
                 <w:sz w:val="22"/>
               </w:rPr>
               <w:t>if</w:t>
@@ -459,6 +479,7 @@
                 <w:rFonts w:ascii="Times New Roman" w:hAnsi="Times New Roman" w:cs="Times New Roman"/>
                 <w:b/>
                 <w:bCs/>
+                <w:color w:val="2E5B3C"/>
                 <w:sz w:val="22"/>
               </w:rPr>
               <w:t xml:space="preserve"> </w:t>
@@ -469,6 +490,7 @@
                 <w:rFonts w:ascii="Times New Roman" w:hAnsi="Times New Roman" w:cs="Times New Roman"/>
                 <w:b/>
                 <w:bCs/>
+                <w:color w:val="2E5B3C"/>
                 <w:sz w:val="22"/>
               </w:rPr>
               <w:t>p.transitos|length</w:t>
@@ -479,6 +501,7 @@
                 <w:rFonts w:ascii="Times New Roman" w:hAnsi="Times New Roman" w:cs="Times New Roman"/>
                 <w:b/>
                 <w:bCs/>
+                <w:color w:val="2E5B3C"/>
                 <w:sz w:val="22"/>
               </w:rPr>
               <w:t xml:space="preserve"> &gt; 0%}</w:t>
@@ -494,6 +517,7 @@
               <w:left w:val="single" w:sz="4" w:space="0" w:color="000000"/>
               <w:bottom w:val="single" w:sz="4" w:space="0" w:color="000000"/>
             </w:tcBorders>
+            <w:shd w:val="clear" w:fill="2E5B3C"/>
           </w:tcPr>
           <w:p>
             <w:pPr>
@@ -504,6 +528,7 @@
               <w:rPr>
                 <w:rFonts w:ascii="Times New Roman" w:hAnsi="Times New Roman" w:cs="Times New Roman"/>
                 <w:b/>
+                <w:color w:val="FFFFFF"/>
               </w:rPr>
               <w:t>Processo original</w:t>
             </w:r>
@@ -516,6 +541,7 @@
               <w:left w:val="single" w:sz="4" w:space="0" w:color="000000"/>
               <w:bottom w:val="single" w:sz="4" w:space="0" w:color="000000"/>
             </w:tcBorders>
+            <w:shd w:val="clear" w:fill="2E5B3C"/>
           </w:tcPr>
           <w:p>
             <w:pPr>
@@ -526,6 +552,7 @@
               <w:rPr>
                 <w:rFonts w:ascii="Times New Roman" w:hAnsi="Times New Roman" w:cs="Times New Roman"/>
                 <w:b/>
+                <w:color w:val="FFFFFF"/>
               </w:rPr>
               <w:t>Processo de execução</w:t>
             </w:r>
@@ -538,6 +565,7 @@
               <w:left w:val="single" w:sz="4" w:space="0" w:color="000000"/>
               <w:bottom w:val="single" w:sz="4" w:space="0" w:color="000000"/>
             </w:tcBorders>
+            <w:shd w:val="clear" w:fill="2E5B3C"/>
           </w:tcPr>
           <w:p>
             <w:pPr>
@@ -548,6 +576,7 @@
               <w:rPr>
                 <w:rFonts w:ascii="Times New Roman" w:hAnsi="Times New Roman" w:cs="Times New Roman"/>
                 <w:b/>
+                <w:color w:val="FFFFFF"/>
               </w:rPr>
               <w:t>Tipo de condenação</w:t>
             </w:r>
@@ -560,6 +589,7 @@
               <w:left w:val="single" w:sz="4" w:space="0" w:color="000000"/>
               <w:bottom w:val="single" w:sz="4" w:space="0" w:color="000000"/>
             </w:tcBorders>
+            <w:shd w:val="clear" w:fill="2E5B3C"/>
           </w:tcPr>
           <w:p>
             <w:pPr>
@@ -570,6 +600,7 @@
               <w:rPr>
                 <w:rFonts w:ascii="Times New Roman" w:hAnsi="Times New Roman" w:cs="Times New Roman"/>
                 <w:b/>
+                <w:color w:val="FFFFFF"/>
               </w:rPr>
               <w:t>Valor original</w:t>
             </w:r>
@@ -582,6 +613,7 @@
               <w:left w:val="single" w:sz="4" w:space="0" w:color="000000"/>
               <w:bottom w:val="single" w:sz="4" w:space="0" w:color="000000"/>
             </w:tcBorders>
+            <w:shd w:val="clear" w:fill="2E5B3C"/>
           </w:tcPr>
           <w:p>
             <w:pPr>
@@ -592,6 +624,7 @@
               <w:rPr>
                 <w:rFonts w:ascii="Times New Roman" w:hAnsi="Times New Roman" w:cs="Times New Roman"/>
                 <w:b/>
+                <w:color w:val="FFFFFF"/>
               </w:rPr>
               <w:t>Valor Atualizado</w:t>
             </w:r>
@@ -604,6 +637,7 @@
               <w:left w:val="single" w:sz="4" w:space="0" w:color="000000"/>
               <w:bottom w:val="single" w:sz="4" w:space="0" w:color="000000"/>
             </w:tcBorders>
+            <w:shd w:val="clear" w:fill="2E5B3C"/>
           </w:tcPr>
           <w:p>
             <w:pPr>
@@ -614,6 +648,7 @@
               <w:rPr>
                 <w:rFonts w:ascii="Times New Roman" w:hAnsi="Times New Roman" w:cs="Times New Roman"/>
                 <w:b/>
+                <w:color w:val="FFFFFF"/>
               </w:rPr>
               <w:t>Trânsito em julgado</w:t>
             </w:r>
@@ -627,6 +662,7 @@
               <w:bottom w:val="single" w:sz="4" w:space="0" w:color="000000"/>
               <w:right w:val="single" w:sz="4" w:space="0" w:color="000000"/>
             </w:tcBorders>
+            <w:shd w:val="clear" w:fill="2E5B3C"/>
           </w:tcPr>
           <w:p>
             <w:pPr>
@@ -637,6 +673,7 @@
               <w:rPr>
                 <w:rFonts w:ascii="Times New Roman" w:hAnsi="Times New Roman" w:cs="Times New Roman"/>
                 <w:b/>
+                <w:color w:val="FFFFFF"/>
               </w:rPr>
               <w:t>Situação da dívida</w:t>
             </w:r>
@@ -709,6 +746,7 @@
             <w:r>
               <w:rPr>
                 <w:rFonts w:ascii="Times New Roman" w:hAnsi="Times New Roman" w:cs="Times New Roman"/>
+                <w:color w:val="333333"/>
                 <w:sz w:val="22"/>
               </w:rPr>
               <w:t>{{</w:t>
@@ -717,6 +755,7 @@
             <w:r>
               <w:rPr>
                 <w:rFonts w:ascii="Times New Roman" w:hAnsi="Times New Roman" w:cs="Times New Roman"/>
+                <w:color w:val="333333"/>
                 <w:sz w:val="22"/>
               </w:rPr>
               <w:t>v.processo_origem</w:t>
@@ -725,6 +764,7 @@
             <w:r>
               <w:rPr>
                 <w:rFonts w:ascii="Times New Roman" w:hAnsi="Times New Roman" w:cs="Times New Roman"/>
+                <w:color w:val="333333"/>
                 <w:sz w:val="22"/>
               </w:rPr>
               <w:t>}}</w:t>
@@ -749,6 +789,7 @@
             <w:r>
               <w:rPr>
                 <w:rFonts w:ascii="Times New Roman" w:hAnsi="Times New Roman" w:cs="Times New Roman"/>
+                <w:color w:val="333333"/>
                 <w:sz w:val="22"/>
               </w:rPr>
               <w:t>{{</w:t>
@@ -757,6 +798,7 @@
             <w:r>
               <w:rPr>
                 <w:rFonts w:ascii="Times New Roman" w:hAnsi="Times New Roman" w:cs="Times New Roman"/>
+                <w:color w:val="333333"/>
                 <w:sz w:val="22"/>
               </w:rPr>
               <w:t>v.processo_execucao</w:t>
@@ -765,6 +807,7 @@
             <w:r>
               <w:rPr>
                 <w:rFonts w:ascii="Times New Roman" w:hAnsi="Times New Roman" w:cs="Times New Roman"/>
+                <w:color w:val="333333"/>
                 <w:sz w:val="22"/>
               </w:rPr>
               <w:t>}}</w:t>
@@ -789,6 +832,7 @@
             <w:r>
               <w:rPr>
                 <w:rFonts w:ascii="Times New Roman" w:hAnsi="Times New Roman" w:cs="Times New Roman"/>
+                <w:color w:val="333333"/>
                 <w:sz w:val="22"/>
               </w:rPr>
               <w:t>{{</w:t>
@@ -797,6 +841,7 @@
             <w:r>
               <w:rPr>
                 <w:rFonts w:ascii="Times New Roman" w:hAnsi="Times New Roman" w:cs="Times New Roman"/>
+                <w:color w:val="333333"/>
                 <w:sz w:val="22"/>
               </w:rPr>
               <w:t>v.tipo_debito</w:t>
@@ -805,6 +850,7 @@
             <w:r>
               <w:rPr>
                 <w:rFonts w:ascii="Times New Roman" w:hAnsi="Times New Roman" w:cs="Times New Roman"/>
+                <w:color w:val="333333"/>
                 <w:sz w:val="22"/>
               </w:rPr>
               <w:t>}}</w:t>
@@ -829,6 +875,7 @@
             <w:r>
               <w:rPr>
                 <w:rFonts w:ascii="Times New Roman" w:hAnsi="Times New Roman" w:cs="Times New Roman"/>
+                <w:color w:val="333333"/>
                 <w:sz w:val="22"/>
               </w:rPr>
               <w:t>{{</w:t>
@@ -837,6 +884,7 @@
             <w:r>
               <w:rPr>
                 <w:rFonts w:ascii="Times New Roman" w:hAnsi="Times New Roman" w:cs="Times New Roman"/>
+                <w:color w:val="333333"/>
                 <w:sz w:val="22"/>
               </w:rPr>
               <w:t>v.valor_original</w:t>
@@ -845,6 +893,7 @@
             <w:r>
               <w:rPr>
                 <w:rFonts w:ascii="Times New Roman" w:hAnsi="Times New Roman" w:cs="Times New Roman"/>
+                <w:color w:val="333333"/>
                 <w:sz w:val="22"/>
               </w:rPr>
               <w:t>}}</w:t>
@@ -869,6 +918,7 @@
             <w:r>
               <w:rPr>
                 <w:rFonts w:ascii="Times New Roman" w:hAnsi="Times New Roman" w:cs="Times New Roman"/>
+                <w:color w:val="333333"/>
                 <w:sz w:val="22"/>
               </w:rPr>
               <w:t>{{</w:t>
@@ -877,6 +927,7 @@
             <w:r>
               <w:rPr>
                 <w:rFonts w:ascii="Times New Roman" w:hAnsi="Times New Roman" w:cs="Times New Roman"/>
+                <w:color w:val="333333"/>
                 <w:sz w:val="22"/>
               </w:rPr>
               <w:t>v.valor_atualizado</w:t>
@@ -885,6 +936,7 @@
             <w:r>
               <w:rPr>
                 <w:rFonts w:ascii="Times New Roman" w:hAnsi="Times New Roman" w:cs="Times New Roman"/>
+                <w:color w:val="333333"/>
                 <w:sz w:val="22"/>
               </w:rPr>
               <w:t>}}</w:t>
@@ -909,6 +961,7 @@
             <w:r>
               <w:rPr>
                 <w:rFonts w:ascii="Times New Roman" w:hAnsi="Times New Roman" w:cs="Times New Roman"/>
+                <w:color w:val="333333"/>
                 <w:sz w:val="22"/>
               </w:rPr>
               <w:t>{{</w:t>
@@ -917,6 +970,7 @@
             <w:r>
               <w:rPr>
                 <w:rFonts w:ascii="Times New Roman" w:hAnsi="Times New Roman" w:cs="Times New Roman"/>
+                <w:color w:val="333333"/>
                 <w:sz w:val="22"/>
               </w:rPr>
               <w:t>v.transito_julgado</w:t>
@@ -925,6 +979,7 @@
             <w:r>
               <w:rPr>
                 <w:rFonts w:ascii="Times New Roman" w:hAnsi="Times New Roman" w:cs="Times New Roman"/>
+                <w:color w:val="333333"/>
                 <w:sz w:val="22"/>
               </w:rPr>
               <w:t>}}</w:t>
@@ -950,6 +1005,7 @@
             <w:r>
               <w:rPr>
                 <w:rFonts w:ascii="Times New Roman" w:hAnsi="Times New Roman" w:cs="Times New Roman"/>
+                <w:color w:val="333333"/>
                 <w:sz w:val="22"/>
               </w:rPr>
               <w:t>{{</w:t>
@@ -958,6 +1014,7 @@
             <w:r>
               <w:rPr>
                 <w:rFonts w:ascii="Times New Roman" w:hAnsi="Times New Roman" w:cs="Times New Roman"/>
+                <w:color w:val="333333"/>
                 <w:sz w:val="22"/>
               </w:rPr>
               <w:t>v.situacao_divida</w:t>
@@ -966,6 +1023,7 @@
             <w:r>
               <w:rPr>
                 <w:rFonts w:ascii="Times New Roman" w:hAnsi="Times New Roman" w:cs="Times New Roman"/>
+                <w:color w:val="333333"/>
                 <w:sz w:val="22"/>
               </w:rPr>
               <w:t>}}</w:t>
@@ -980,6 +1038,7 @@
             <w:r>
               <w:rPr>
                 <w:rFonts w:ascii="Times New Roman" w:hAnsi="Times New Roman" w:cs="Times New Roman"/>
+                <w:color w:val="333333"/>
                 <w:sz w:val="22"/>
               </w:rPr>
               <w:t xml:space="preserve">{% </w:t>
@@ -989,6 +1048,7 @@
             <w:r>
               <w:rPr>
                 <w:rFonts w:ascii="Times New Roman" w:hAnsi="Times New Roman" w:cs="Times New Roman"/>
+                <w:color w:val="333333"/>
                 <w:sz w:val="22"/>
               </w:rPr>
               <w:t>if</w:t>
@@ -998,6 +1058,7 @@
             <w:r>
               <w:rPr>
                 <w:rFonts w:ascii="Times New Roman" w:hAnsi="Times New Roman" w:cs="Times New Roman"/>
+                <w:color w:val="333333"/>
                 <w:sz w:val="22"/>
               </w:rPr>
               <w:t xml:space="preserve"> </w:t>
@@ -1006,6 +1067,7 @@
             <w:r>
               <w:rPr>
                 <w:rFonts w:ascii="Times New Roman" w:hAnsi="Times New Roman" w:cs="Times New Roman"/>
+                <w:color w:val="333333"/>
                 <w:sz w:val="22"/>
               </w:rPr>
               <w:t>v.status_protesto</w:t>
@@ -1014,6 +1076,7 @@
             <w:r>
               <w:rPr>
                 <w:rFonts w:ascii="Times New Roman" w:hAnsi="Times New Roman" w:cs="Times New Roman"/>
+                <w:color w:val="333333"/>
                 <w:sz w:val="22"/>
               </w:rPr>
               <w:t xml:space="preserve"> %}</w:t>
@@ -1028,6 +1091,7 @@
             <w:r>
               <w:rPr>
                 <w:rFonts w:ascii="Times New Roman" w:hAnsi="Times New Roman" w:cs="Times New Roman"/>
+                <w:color w:val="333333"/>
                 <w:sz w:val="22"/>
               </w:rPr>
               <w:t>- Situação Protesto:</w:t>
@@ -1042,6 +1106,7 @@
             <w:r>
               <w:rPr>
                 <w:rFonts w:ascii="Times New Roman" w:hAnsi="Times New Roman" w:cs="Times New Roman"/>
+                <w:color w:val="333333"/>
                 <w:sz w:val="22"/>
               </w:rPr>
               <w:t xml:space="preserve">{% </w:t>
@@ -1050,6 +1115,7 @@
             <w:r>
               <w:rPr>
                 <w:rFonts w:ascii="Times New Roman" w:hAnsi="Times New Roman" w:cs="Times New Roman"/>
+                <w:color w:val="333333"/>
                 <w:sz w:val="22"/>
               </w:rPr>
               <w:t>endif</w:t>
@@ -1058,6 +1124,7 @@
             <w:r>
               <w:rPr>
                 <w:rFonts w:ascii="Times New Roman" w:hAnsi="Times New Roman" w:cs="Times New Roman"/>
+                <w:color w:val="333333"/>
                 <w:sz w:val="22"/>
               </w:rPr>
               <w:t xml:space="preserve"> %} {{</w:t>
@@ -1066,6 +1133,7 @@
             <w:r>
               <w:rPr>
                 <w:rFonts w:ascii="Times New Roman" w:hAnsi="Times New Roman" w:cs="Times New Roman"/>
+                <w:color w:val="333333"/>
                 <w:sz w:val="22"/>
               </w:rPr>
               <w:t>v.status_protesto</w:t>
@@ -1074,6 +1142,7 @@
             <w:r>
               <w:rPr>
                 <w:rFonts w:ascii="Times New Roman" w:hAnsi="Times New Roman" w:cs="Times New Roman"/>
+                <w:color w:val="333333"/>
                 <w:sz w:val="22"/>
               </w:rPr>
               <w:t>}}</w:t>
@@ -1088,6 +1157,7 @@
             <w:r>
               <w:rPr>
                 <w:rFonts w:ascii="Times New Roman" w:hAnsi="Times New Roman" w:cs="Times New Roman"/>
+                <w:color w:val="333333"/>
                 <w:sz w:val="22"/>
               </w:rPr>
               <w:t xml:space="preserve">{% </w:t>
@@ -1097,6 +1167,7 @@
             <w:r>
               <w:rPr>
                 <w:rFonts w:ascii="Times New Roman" w:hAnsi="Times New Roman" w:cs="Times New Roman"/>
+                <w:color w:val="333333"/>
                 <w:sz w:val="22"/>
               </w:rPr>
               <w:t>if</w:t>
@@ -1106,6 +1177,7 @@
             <w:r>
               <w:rPr>
                 <w:rFonts w:ascii="Times New Roman" w:hAnsi="Times New Roman" w:cs="Times New Roman"/>
+                <w:color w:val="333333"/>
                 <w:sz w:val="22"/>
               </w:rPr>
               <w:t xml:space="preserve"> </w:t>
@@ -1114,6 +1186,7 @@
             <w:r>
               <w:rPr>
                 <w:rFonts w:ascii="Times New Roman" w:hAnsi="Times New Roman" w:cs="Times New Roman"/>
+                <w:color w:val="333333"/>
                 <w:sz w:val="22"/>
               </w:rPr>
               <w:t>v.status_pge</w:t>
@@ -1122,6 +1195,7 @@
             <w:r>
               <w:rPr>
                 <w:rFonts w:ascii="Times New Roman" w:hAnsi="Times New Roman" w:cs="Times New Roman"/>
+                <w:color w:val="333333"/>
                 <w:sz w:val="22"/>
               </w:rPr>
               <w:t xml:space="preserve"> %}</w:t>
@@ -1136,6 +1210,7 @@
             <w:r>
               <w:rPr>
                 <w:rFonts w:ascii="Times New Roman" w:hAnsi="Times New Roman" w:cs="Times New Roman"/>
+                <w:color w:val="333333"/>
                 <w:sz w:val="22"/>
               </w:rPr>
               <w:t>- Situação PGE:</w:t>
@@ -1150,6 +1225,7 @@
             <w:r>
               <w:rPr>
                 <w:rFonts w:ascii="Times New Roman" w:hAnsi="Times New Roman" w:cs="Times New Roman"/>
+                <w:color w:val="333333"/>
                 <w:sz w:val="22"/>
               </w:rPr>
               <w:t xml:space="preserve">{% </w:t>
@@ -1158,6 +1234,7 @@
             <w:r>
               <w:rPr>
                 <w:rFonts w:ascii="Times New Roman" w:hAnsi="Times New Roman" w:cs="Times New Roman"/>
+                <w:color w:val="333333"/>
                 <w:sz w:val="22"/>
               </w:rPr>
               <w:t>endif</w:t>
@@ -1166,6 +1243,7 @@
             <w:r>
               <w:rPr>
                 <w:rFonts w:ascii="Times New Roman" w:hAnsi="Times New Roman" w:cs="Times New Roman"/>
+                <w:color w:val="333333"/>
                 <w:sz w:val="22"/>
               </w:rPr>
               <w:t xml:space="preserve"> %</w:t>
@@ -1174,6 +1252,7 @@
             <w:r>
               <w:rPr>
                 <w:rFonts w:ascii="Times New Roman" w:hAnsi="Times New Roman" w:cs="Times New Roman"/>
+                <w:color w:val="333333"/>
                 <w:sz w:val="22"/>
               </w:rPr>
               <w:t>}{</w:t>
@@ -1182,6 +1261,7 @@
             <w:r>
               <w:rPr>
                 <w:rFonts w:ascii="Times New Roman" w:hAnsi="Times New Roman" w:cs="Times New Roman"/>
+                <w:color w:val="333333"/>
                 <w:sz w:val="22"/>
               </w:rPr>
               <w:t>{</w:t>
@@ -1190,6 +1270,7 @@
             <w:r>
               <w:rPr>
                 <w:rFonts w:ascii="Times New Roman" w:hAnsi="Times New Roman" w:cs="Times New Roman"/>
+                <w:color w:val="333333"/>
                 <w:sz w:val="22"/>
               </w:rPr>
               <w:t>v.status_pge</w:t>
@@ -1198,6 +1279,7 @@
             <w:r>
               <w:rPr>
                 <w:rFonts w:ascii="Times New Roman" w:hAnsi="Times New Roman" w:cs="Times New Roman"/>
+                <w:color w:val="333333"/>
                 <w:sz w:val="22"/>
               </w:rPr>
               <w:t>}}</w:t>
@@ -1308,6 +1390,8 @@
             <w:r>
               <w:rPr>
                 <w:rFonts w:ascii="Times New Roman" w:hAnsi="Times New Roman" w:cs="Times New Roman"/>
+                <w:b/>
+                <w:color w:val="2E5B3C"/>
                 <w:sz w:val="22"/>
               </w:rPr>
               <w:t>Não há condenações para {{</w:t>
@@ -1316,6 +1400,8 @@
             <w:r>
               <w:rPr>
                 <w:rFonts w:ascii="Times New Roman" w:hAnsi="Times New Roman" w:cs="Times New Roman"/>
+                <w:b/>
+                <w:color w:val="2E5B3C"/>
                 <w:sz w:val="22"/>
               </w:rPr>
               <w:t>p.nome</w:t>
@@ -1324,6 +1410,8 @@
             <w:r>
               <w:rPr>
                 <w:rFonts w:ascii="Times New Roman" w:hAnsi="Times New Roman" w:cs="Times New Roman"/>
+                <w:b/>
+                <w:color w:val="2E5B3C"/>
                 <w:sz w:val="22"/>
               </w:rPr>
               <w:t xml:space="preserve">}} {% </w:t>
@@ -1332,6 +1420,8 @@
             <w:r>
               <w:rPr>
                 <w:rFonts w:ascii="Times New Roman" w:hAnsi="Times New Roman" w:cs="Times New Roman"/>
+                <w:b/>
+                <w:color w:val="2E5B3C"/>
                 <w:sz w:val="22"/>
               </w:rPr>
               <w:t>endif</w:t>
@@ -1340,6 +1430,8 @@
             <w:r>
               <w:rPr>
                 <w:rFonts w:ascii="Times New Roman" w:hAnsi="Times New Roman" w:cs="Times New Roman"/>
+                <w:b/>
+                <w:color w:val="2E5B3C"/>
                 <w:sz w:val="22"/>
               </w:rPr>
               <w:t xml:space="preserve"> %}</w:t>
@@ -1500,25 +1592,27 @@
       <w:pPr>
         <w:jc w:val="center"/>
       </w:pPr>
+      <w:proofErr w:type="spellStart"/>
+      <w:proofErr w:type="spellEnd"/>
       <w:r>
         <w:rPr>
           <w:b/>
         </w:rPr>
         <w:t>Eduardo Pereira Lima</w:t>
-      </w:r>
-      <w:r>
-        <w:rPr>
-          <w:b/>
-        </w:rPr>
         <w:br/>
       </w:r>
-      <w:proofErr w:type="spellStart"/>
-      <w:r>
-        <w:t>Coodenador</w:t>
-      </w:r>
-      <w:proofErr w:type="spellEnd"/>
-      <w:r>
-        <w:t xml:space="preserve"> de Controle de Decisões</w:t>
+      <w:r>
+        <w:rPr>
+          <w:b w:val="0"/>
+        </w:rPr>
+        <w:t>Auditor de Controle Externo</w:t>
+        <w:br/>
+      </w:r>
+      <w:r>
+        <w:rPr>
+          <w:b w:val="0"/>
+        </w:rPr>
+        <w:t>Coordenador de Controle de Decisões</w:t>
       </w:r>
     </w:p>
     <w:p>
@@ -1529,45 +1623,6 @@
           <w:b/>
         </w:rPr>
       </w:pPr>
-    </w:p>
-    <w:p>
-      <w:pPr>
-        <w:jc w:val="center"/>
-        <w:rPr>
-          <w:b/>
-        </w:rPr>
-      </w:pPr>
-      <w:proofErr w:type="spellStart"/>
-      <w:r>
-        <w:rPr>
-          <w:b/>
-        </w:rPr>
-        <w:t>Shárada</w:t>
-      </w:r>
-      <w:proofErr w:type="spellEnd"/>
-      <w:r>
-        <w:rPr>
-          <w:b/>
-        </w:rPr>
-        <w:t xml:space="preserve"> Soares </w:t>
-      </w:r>
-      <w:proofErr w:type="spellStart"/>
-      <w:r>
-        <w:rPr>
-          <w:b/>
-        </w:rPr>
-        <w:t>Jewur</w:t>
-      </w:r>
-      <w:proofErr w:type="spellEnd"/>
-      <w:r>
-        <w:rPr>
-          <w:b/>
-        </w:rPr>
-        <w:br/>
-      </w:r>
-      <w:r>
-        <w:t>Diretora de Instrução Processual e Controle de Decisões</w:t>
-      </w:r>
     </w:p>
     <w:sectPr>
       <w:headerReference w:type="default" r:id="rId7"/>

</xml_diff>